<commit_message>
Libretto Marco: registra la stesura del testo della Fase 0
Co-Authored-By: Claude Opus 5.5 <noreply@anthropic.com>
Claude-Session: https://claude.ai/code/session_01QUwMQnWthd5ivAEv8jHZes
</commit_message>
<xml_diff>
--- a/docs/libretti/marco-buffa.docx
+++ b/docs/libretti/marco-buffa.docx
@@ -317,7 +317,7 @@
                 <w:sz w:val="19"/>
                 <w:szCs w:val="19"/>
               </w:rPr>
-              <w:t xml:space="preserve"/>
+              <w:t xml:space="preserve">29/09/2026</w:t>
             </w:r>
           </w:p>
         </w:tc>
@@ -341,13 +341,13 @@
             <w:r>
               <w:rPr>
                 <w:rFonts w:ascii="Calibri" w:cs="Calibri" w:eastAsia="Calibri" w:hAnsi="Calibri"/>
-                <w:b w:val="false"/>
-                <w:bCs w:val="false"/>
-                <w:color w:val="333333"/>
-                <w:sz w:val="19"/>
-                <w:szCs w:val="19"/>
-              </w:rPr>
-              <w:t xml:space="preserve"/>
+                <w:b/>
+                <w:bCs/>
+                <w:color w:val="333333"/>
+                <w:sz w:val="19"/>
+                <w:szCs w:val="19"/>
+              </w:rPr>
+              <w:t xml:space="preserve">Fase 0 — Proposta di progetto</w:t>
             </w:r>
           </w:p>
         </w:tc>
@@ -377,7 +377,7 @@
                 <w:sz w:val="19"/>
                 <w:szCs w:val="19"/>
               </w:rPr>
-              <w:t xml:space="preserve"/>
+              <w:t xml:space="preserve">Stesura del testo della proposta di progetto «Trento nascosta»: contesto turistico di Trento, problema (storia cittadina e affreschi del centro poco valorizzati e difficili da trovare), idea della guida turistica non convenzionale e funzionalità principali.</w:t>
             </w:r>
           </w:p>
         </w:tc>
@@ -407,7 +407,7 @@
                 <w:sz w:val="19"/>
                 <w:szCs w:val="19"/>
               </w:rPr>
-              <w:t xml:space="preserve"/>
+              <w:t xml:space="preserve">docs/fase-0-proposta-progetto.pdf</w:t>
             </w:r>
           </w:p>
         </w:tc>

</xml_diff>

<commit_message>
Libretto Marco: una sola voce per la presentazione, datata 06/10/2026
Co-Authored-By: Claude Opus 5.5 <noreply@anthropic.com>
</commit_message>
<xml_diff>
--- a/docs/libretti/marco-buffa.docx
+++ b/docs/libretti/marco-buffa.docx
@@ -440,7 +440,7 @@
                 <w:sz w:val="19"/>
                 <w:szCs w:val="19"/>
               </w:rPr>
-              <w:t xml:space="preserve">09/10/2026</w:t>
+              <w:t xml:space="preserve">06/10/2026</w:t>
             </w:r>
           </w:p>
         </w:tc>
@@ -670,25 +670,24 @@
               <w:bottom w:val="single" w:color="D9CFC0" w:sz="4"/>
               <w:right w:val="single" w:color="D9CFC0" w:sz="4"/>
             </w:tcBorders>
-            <w:shd w:fill="FBF8F3" w:color="auto" w:val="clear"/>
-            <w:tcMar>
-              <w:top w:type="dxa" w:w="80"/>
-              <w:left w:type="dxa" w:w="110"/>
-              <w:bottom w:type="dxa" w:w="80"/>
-              <w:right w:type="dxa" w:w="110"/>
-            </w:tcMar>
-          </w:tcPr>
-          <w:p>
-            <w:r>
-              <w:rPr>
-                <w:rFonts w:ascii="Calibri" w:cs="Calibri" w:eastAsia="Calibri" w:hAnsi="Calibri"/>
-                <w:b w:val="false"/>
-                <w:bCs w:val="false"/>
-                <w:color w:val="333333"/>
-                <w:sz w:val="19"/>
-                <w:szCs w:val="19"/>
-              </w:rPr>
-              <w:t xml:space="preserve">09/10/2026</w:t>
+            <w:tcMar>
+              <w:top w:type="dxa" w:w="80"/>
+              <w:left w:type="dxa" w:w="110"/>
+              <w:bottom w:type="dxa" w:w="80"/>
+              <w:right w:type="dxa" w:w="110"/>
+            </w:tcMar>
+          </w:tcPr>
+          <w:p>
+            <w:r>
+              <w:rPr>
+                <w:rFonts w:ascii="Calibri" w:cs="Calibri" w:eastAsia="Calibri" w:hAnsi="Calibri"/>
+                <w:b w:val="false"/>
+                <w:bCs w:val="false"/>
+                <w:color w:val="333333"/>
+                <w:sz w:val="19"/>
+                <w:szCs w:val="19"/>
+              </w:rPr>
+              <w:t xml:space="preserve"/>
             </w:r>
           </w:p>
         </w:tc>
@@ -701,25 +700,24 @@
               <w:bottom w:val="single" w:color="D9CFC0" w:sz="4"/>
               <w:right w:val="single" w:color="D9CFC0" w:sz="4"/>
             </w:tcBorders>
-            <w:shd w:fill="FBF8F3" w:color="auto" w:val="clear"/>
-            <w:tcMar>
-              <w:top w:type="dxa" w:w="80"/>
-              <w:left w:type="dxa" w:w="110"/>
-              <w:bottom w:type="dxa" w:w="80"/>
-              <w:right w:type="dxa" w:w="110"/>
-            </w:tcMar>
-          </w:tcPr>
-          <w:p>
-            <w:r>
-              <w:rPr>
-                <w:rFonts w:ascii="Calibri" w:cs="Calibri" w:eastAsia="Calibri" w:hAnsi="Calibri"/>
-                <w:b/>
-                <w:bCs/>
-                <w:color w:val="333333"/>
-                <w:sz w:val="19"/>
-                <w:szCs w:val="19"/>
-              </w:rPr>
-              <w:t xml:space="preserve">Aggiornamento presentazione</w:t>
+            <w:tcMar>
+              <w:top w:type="dxa" w:w="80"/>
+              <w:left w:type="dxa" w:w="110"/>
+              <w:bottom w:type="dxa" w:w="80"/>
+              <w:right w:type="dxa" w:w="110"/>
+            </w:tcMar>
+          </w:tcPr>
+          <w:p>
+            <w:r>
+              <w:rPr>
+                <w:rFonts w:ascii="Calibri" w:cs="Calibri" w:eastAsia="Calibri" w:hAnsi="Calibri"/>
+                <w:b w:val="false"/>
+                <w:bCs w:val="false"/>
+                <w:color w:val="333333"/>
+                <w:sz w:val="19"/>
+                <w:szCs w:val="19"/>
+              </w:rPr>
+              <w:t xml:space="preserve"/>
             </w:r>
           </w:p>
         </w:tc>
@@ -732,25 +730,24 @@
               <w:bottom w:val="single" w:color="D9CFC0" w:sz="4"/>
               <w:right w:val="single" w:color="D9CFC0" w:sz="4"/>
             </w:tcBorders>
-            <w:shd w:fill="FBF8F3" w:color="auto" w:val="clear"/>
-            <w:tcMar>
-              <w:top w:type="dxa" w:w="80"/>
-              <w:left w:type="dxa" w:w="110"/>
-              <w:bottom w:type="dxa" w:w="80"/>
-              <w:right w:type="dxa" w:w="110"/>
-            </w:tcMar>
-          </w:tcPr>
-          <w:p>
-            <w:r>
-              <w:rPr>
-                <w:rFonts w:ascii="Calibri" w:cs="Calibri" w:eastAsia="Calibri" w:hAnsi="Calibri"/>
-                <w:b w:val="false"/>
-                <w:bCs w:val="false"/>
-                <w:color w:val="333333"/>
-                <w:sz w:val="19"/>
-                <w:szCs w:val="19"/>
-              </w:rPr>
-              <w:t xml:space="preserve">Pubblicata nel repository la versione aggiornata della presentazione del progetto.</w:t>
+            <w:tcMar>
+              <w:top w:type="dxa" w:w="80"/>
+              <w:left w:type="dxa" w:w="110"/>
+              <w:bottom w:type="dxa" w:w="80"/>
+              <w:right w:type="dxa" w:w="110"/>
+            </w:tcMar>
+          </w:tcPr>
+          <w:p>
+            <w:r>
+              <w:rPr>
+                <w:rFonts w:ascii="Calibri" w:cs="Calibri" w:eastAsia="Calibri" w:hAnsi="Calibri"/>
+                <w:b w:val="false"/>
+                <w:bCs w:val="false"/>
+                <w:color w:val="333333"/>
+                <w:sz w:val="19"/>
+                <w:szCs w:val="19"/>
+              </w:rPr>
+              <w:t xml:space="preserve"/>
             </w:r>
           </w:p>
         </w:tc>
@@ -763,25 +760,24 @@
               <w:bottom w:val="single" w:color="D9CFC0" w:sz="4"/>
               <w:right w:val="single" w:color="D9CFC0" w:sz="4"/>
             </w:tcBorders>
-            <w:shd w:fill="FBF8F3" w:color="auto" w:val="clear"/>
-            <w:tcMar>
-              <w:top w:type="dxa" w:w="80"/>
-              <w:left w:type="dxa" w:w="110"/>
-              <w:bottom w:type="dxa" w:w="80"/>
-              <w:right w:type="dxa" w:w="110"/>
-            </w:tcMar>
-          </w:tcPr>
-          <w:p>
-            <w:r>
-              <w:rPr>
-                <w:rFonts w:ascii="Calibri" w:cs="Calibri" w:eastAsia="Calibri" w:hAnsi="Calibri"/>
-                <w:b w:val="false"/>
-                <w:bCs w:val="false"/>
-                <w:color w:val="333333"/>
-                <w:sz w:val="19"/>
-                <w:szCs w:val="19"/>
-              </w:rPr>
-              <w:t xml:space="preserve">presentazioni/presentazione-v2.pptx</w:t>
+            <w:tcMar>
+              <w:top w:type="dxa" w:w="80"/>
+              <w:left w:type="dxa" w:w="110"/>
+              <w:bottom w:type="dxa" w:w="80"/>
+              <w:right w:type="dxa" w:w="110"/>
+            </w:tcMar>
+          </w:tcPr>
+          <w:p>
+            <w:r>
+              <w:rPr>
+                <w:rFonts w:ascii="Calibri" w:cs="Calibri" w:eastAsia="Calibri" w:hAnsi="Calibri"/>
+                <w:b w:val="false"/>
+                <w:bCs w:val="false"/>
+                <w:color w:val="333333"/>
+                <w:sz w:val="19"/>
+                <w:szCs w:val="19"/>
+              </w:rPr>
+              <w:t xml:space="preserve"/>
             </w:r>
           </w:p>
         </w:tc>
@@ -918,25 +914,24 @@
               <w:bottom w:val="single" w:color="D9CFC0" w:sz="4"/>
               <w:right w:val="single" w:color="D9CFC0" w:sz="4"/>
             </w:tcBorders>
-            <w:shd w:fill="FBF8F3" w:color="auto" w:val="clear"/>
-            <w:tcMar>
-              <w:top w:type="dxa" w:w="80"/>
-              <w:left w:type="dxa" w:w="110"/>
-              <w:bottom w:type="dxa" w:w="80"/>
-              <w:right w:type="dxa" w:w="110"/>
-            </w:tcMar>
-          </w:tcPr>
-          <w:p>
-            <w:r>
-              <w:rPr>
-                <w:rFonts w:ascii="Calibri" w:cs="Calibri" w:eastAsia="Calibri" w:hAnsi="Calibri"/>
-                <w:b w:val="false"/>
-                <w:bCs w:val="false"/>
-                <w:color w:val="333333"/>
-                <w:sz w:val="19"/>
-                <w:szCs w:val="19"/>
-              </w:rPr>
-              <w:t xml:space="preserve">09/10/2026</w:t>
+            <w:tcMar>
+              <w:top w:type="dxa" w:w="80"/>
+              <w:left w:type="dxa" w:w="110"/>
+              <w:bottom w:type="dxa" w:w="80"/>
+              <w:right w:type="dxa" w:w="110"/>
+            </w:tcMar>
+          </w:tcPr>
+          <w:p>
+            <w:r>
+              <w:rPr>
+                <w:rFonts w:ascii="Calibri" w:cs="Calibri" w:eastAsia="Calibri" w:hAnsi="Calibri"/>
+                <w:b w:val="false"/>
+                <w:bCs w:val="false"/>
+                <w:color w:val="333333"/>
+                <w:sz w:val="19"/>
+                <w:szCs w:val="19"/>
+              </w:rPr>
+              <w:t xml:space="preserve"/>
             </w:r>
           </w:p>
         </w:tc>
@@ -949,25 +944,24 @@
               <w:bottom w:val="single" w:color="D9CFC0" w:sz="4"/>
               <w:right w:val="single" w:color="D9CFC0" w:sz="4"/>
             </w:tcBorders>
-            <w:shd w:fill="FBF8F3" w:color="auto" w:val="clear"/>
-            <w:tcMar>
-              <w:top w:type="dxa" w:w="80"/>
-              <w:left w:type="dxa" w:w="110"/>
-              <w:bottom w:type="dxa" w:w="80"/>
-              <w:right w:type="dxa" w:w="110"/>
-            </w:tcMar>
-          </w:tcPr>
-          <w:p>
-            <w:r>
-              <w:rPr>
-                <w:rFonts w:ascii="Calibri" w:cs="Calibri" w:eastAsia="Calibri" w:hAnsi="Calibri"/>
-                <w:b/>
-                <w:bCs/>
-                <w:color w:val="333333"/>
-                <w:sz w:val="19"/>
-                <w:szCs w:val="19"/>
-              </w:rPr>
-              <w:t xml:space="preserve">Aggiornamento presentazione</w:t>
+            <w:tcMar>
+              <w:top w:type="dxa" w:w="80"/>
+              <w:left w:type="dxa" w:w="110"/>
+              <w:bottom w:type="dxa" w:w="80"/>
+              <w:right w:type="dxa" w:w="110"/>
+            </w:tcMar>
+          </w:tcPr>
+          <w:p>
+            <w:r>
+              <w:rPr>
+                <w:rFonts w:ascii="Calibri" w:cs="Calibri" w:eastAsia="Calibri" w:hAnsi="Calibri"/>
+                <w:b w:val="false"/>
+                <w:bCs w:val="false"/>
+                <w:color w:val="333333"/>
+                <w:sz w:val="19"/>
+                <w:szCs w:val="19"/>
+              </w:rPr>
+              <w:t xml:space="preserve"/>
             </w:r>
           </w:p>
         </w:tc>
@@ -980,25 +974,24 @@
               <w:bottom w:val="single" w:color="D9CFC0" w:sz="4"/>
               <w:right w:val="single" w:color="D9CFC0" w:sz="4"/>
             </w:tcBorders>
-            <w:shd w:fill="FBF8F3" w:color="auto" w:val="clear"/>
-            <w:tcMar>
-              <w:top w:type="dxa" w:w="80"/>
-              <w:left w:type="dxa" w:w="110"/>
-              <w:bottom w:type="dxa" w:w="80"/>
-              <w:right w:type="dxa" w:w="110"/>
-            </w:tcMar>
-          </w:tcPr>
-          <w:p>
-            <w:r>
-              <w:rPr>
-                <w:rFonts w:ascii="Calibri" w:cs="Calibri" w:eastAsia="Calibri" w:hAnsi="Calibri"/>
-                <w:b w:val="false"/>
-                <w:bCs w:val="false"/>
-                <w:color w:val="333333"/>
-                <w:sz w:val="19"/>
-                <w:szCs w:val="19"/>
-              </w:rPr>
-              <w:t xml:space="preserve">Pubblicata nel repository la versione aggiornata della presentazione del progetto.</w:t>
+            <w:tcMar>
+              <w:top w:type="dxa" w:w="80"/>
+              <w:left w:type="dxa" w:w="110"/>
+              <w:bottom w:type="dxa" w:w="80"/>
+              <w:right w:type="dxa" w:w="110"/>
+            </w:tcMar>
+          </w:tcPr>
+          <w:p>
+            <w:r>
+              <w:rPr>
+                <w:rFonts w:ascii="Calibri" w:cs="Calibri" w:eastAsia="Calibri" w:hAnsi="Calibri"/>
+                <w:b w:val="false"/>
+                <w:bCs w:val="false"/>
+                <w:color w:val="333333"/>
+                <w:sz w:val="19"/>
+                <w:szCs w:val="19"/>
+              </w:rPr>
+              <w:t xml:space="preserve"/>
             </w:r>
           </w:p>
         </w:tc>
@@ -1011,25 +1004,24 @@
               <w:bottom w:val="single" w:color="D9CFC0" w:sz="4"/>
               <w:right w:val="single" w:color="D9CFC0" w:sz="4"/>
             </w:tcBorders>
-            <w:shd w:fill="FBF8F3" w:color="auto" w:val="clear"/>
-            <w:tcMar>
-              <w:top w:type="dxa" w:w="80"/>
-              <w:left w:type="dxa" w:w="110"/>
-              <w:bottom w:type="dxa" w:w="80"/>
-              <w:right w:type="dxa" w:w="110"/>
-            </w:tcMar>
-          </w:tcPr>
-          <w:p>
-            <w:r>
-              <w:rPr>
-                <w:rFonts w:ascii="Calibri" w:cs="Calibri" w:eastAsia="Calibri" w:hAnsi="Calibri"/>
-                <w:b w:val="false"/>
-                <w:bCs w:val="false"/>
-                <w:color w:val="333333"/>
-                <w:sz w:val="19"/>
-                <w:szCs w:val="19"/>
-              </w:rPr>
-              <w:t xml:space="preserve">presentazioni/presentazione-v2.pptx</w:t>
+            <w:tcMar>
+              <w:top w:type="dxa" w:w="80"/>
+              <w:left w:type="dxa" w:w="110"/>
+              <w:bottom w:type="dxa" w:w="80"/>
+              <w:right w:type="dxa" w:w="110"/>
+            </w:tcMar>
+          </w:tcPr>
+          <w:p>
+            <w:r>
+              <w:rPr>
+                <w:rFonts w:ascii="Calibri" w:cs="Calibri" w:eastAsia="Calibri" w:hAnsi="Calibri"/>
+                <w:b w:val="false"/>
+                <w:bCs w:val="false"/>
+                <w:color w:val="333333"/>
+                <w:sz w:val="19"/>
+                <w:szCs w:val="19"/>
+              </w:rPr>
+              <w:t xml:space="preserve"/>
             </w:r>
           </w:p>
         </w:tc>
@@ -1166,25 +1158,24 @@
               <w:bottom w:val="single" w:color="D9CFC0" w:sz="4"/>
               <w:right w:val="single" w:color="D9CFC0" w:sz="4"/>
             </w:tcBorders>
-            <w:shd w:fill="FBF8F3" w:color="auto" w:val="clear"/>
-            <w:tcMar>
-              <w:top w:type="dxa" w:w="80"/>
-              <w:left w:type="dxa" w:w="110"/>
-              <w:bottom w:type="dxa" w:w="80"/>
-              <w:right w:type="dxa" w:w="110"/>
-            </w:tcMar>
-          </w:tcPr>
-          <w:p>
-            <w:r>
-              <w:rPr>
-                <w:rFonts w:ascii="Calibri" w:cs="Calibri" w:eastAsia="Calibri" w:hAnsi="Calibri"/>
-                <w:b w:val="false"/>
-                <w:bCs w:val="false"/>
-                <w:color w:val="333333"/>
-                <w:sz w:val="19"/>
-                <w:szCs w:val="19"/>
-              </w:rPr>
-              <w:t xml:space="preserve">09/10/2026</w:t>
+            <w:tcMar>
+              <w:top w:type="dxa" w:w="80"/>
+              <w:left w:type="dxa" w:w="110"/>
+              <w:bottom w:type="dxa" w:w="80"/>
+              <w:right w:type="dxa" w:w="110"/>
+            </w:tcMar>
+          </w:tcPr>
+          <w:p>
+            <w:r>
+              <w:rPr>
+                <w:rFonts w:ascii="Calibri" w:cs="Calibri" w:eastAsia="Calibri" w:hAnsi="Calibri"/>
+                <w:b w:val="false"/>
+                <w:bCs w:val="false"/>
+                <w:color w:val="333333"/>
+                <w:sz w:val="19"/>
+                <w:szCs w:val="19"/>
+              </w:rPr>
+              <w:t xml:space="preserve"/>
             </w:r>
           </w:p>
         </w:tc>
@@ -1197,25 +1188,24 @@
               <w:bottom w:val="single" w:color="D9CFC0" w:sz="4"/>
               <w:right w:val="single" w:color="D9CFC0" w:sz="4"/>
             </w:tcBorders>
-            <w:shd w:fill="FBF8F3" w:color="auto" w:val="clear"/>
-            <w:tcMar>
-              <w:top w:type="dxa" w:w="80"/>
-              <w:left w:type="dxa" w:w="110"/>
-              <w:bottom w:type="dxa" w:w="80"/>
-              <w:right w:type="dxa" w:w="110"/>
-            </w:tcMar>
-          </w:tcPr>
-          <w:p>
-            <w:r>
-              <w:rPr>
-                <w:rFonts w:ascii="Calibri" w:cs="Calibri" w:eastAsia="Calibri" w:hAnsi="Calibri"/>
-                <w:b/>
-                <w:bCs/>
-                <w:color w:val="333333"/>
-                <w:sz w:val="19"/>
-                <w:szCs w:val="19"/>
-              </w:rPr>
-              <w:t xml:space="preserve">Aggiornamento presentazione</w:t>
+            <w:tcMar>
+              <w:top w:type="dxa" w:w="80"/>
+              <w:left w:type="dxa" w:w="110"/>
+              <w:bottom w:type="dxa" w:w="80"/>
+              <w:right w:type="dxa" w:w="110"/>
+            </w:tcMar>
+          </w:tcPr>
+          <w:p>
+            <w:r>
+              <w:rPr>
+                <w:rFonts w:ascii="Calibri" w:cs="Calibri" w:eastAsia="Calibri" w:hAnsi="Calibri"/>
+                <w:b w:val="false"/>
+                <w:bCs w:val="false"/>
+                <w:color w:val="333333"/>
+                <w:sz w:val="19"/>
+                <w:szCs w:val="19"/>
+              </w:rPr>
+              <w:t xml:space="preserve"/>
             </w:r>
           </w:p>
         </w:tc>
@@ -1228,25 +1218,24 @@
               <w:bottom w:val="single" w:color="D9CFC0" w:sz="4"/>
               <w:right w:val="single" w:color="D9CFC0" w:sz="4"/>
             </w:tcBorders>
-            <w:shd w:fill="FBF8F3" w:color="auto" w:val="clear"/>
-            <w:tcMar>
-              <w:top w:type="dxa" w:w="80"/>
-              <w:left w:type="dxa" w:w="110"/>
-              <w:bottom w:type="dxa" w:w="80"/>
-              <w:right w:type="dxa" w:w="110"/>
-            </w:tcMar>
-          </w:tcPr>
-          <w:p>
-            <w:r>
-              <w:rPr>
-                <w:rFonts w:ascii="Calibri" w:cs="Calibri" w:eastAsia="Calibri" w:hAnsi="Calibri"/>
-                <w:b w:val="false"/>
-                <w:bCs w:val="false"/>
-                <w:color w:val="333333"/>
-                <w:sz w:val="19"/>
-                <w:szCs w:val="19"/>
-              </w:rPr>
-              <w:t xml:space="preserve">Pubblicata nel repository la versione aggiornata della presentazione del progetto.</w:t>
+            <w:tcMar>
+              <w:top w:type="dxa" w:w="80"/>
+              <w:left w:type="dxa" w:w="110"/>
+              <w:bottom w:type="dxa" w:w="80"/>
+              <w:right w:type="dxa" w:w="110"/>
+            </w:tcMar>
+          </w:tcPr>
+          <w:p>
+            <w:r>
+              <w:rPr>
+                <w:rFonts w:ascii="Calibri" w:cs="Calibri" w:eastAsia="Calibri" w:hAnsi="Calibri"/>
+                <w:b w:val="false"/>
+                <w:bCs w:val="false"/>
+                <w:color w:val="333333"/>
+                <w:sz w:val="19"/>
+                <w:szCs w:val="19"/>
+              </w:rPr>
+              <w:t xml:space="preserve"/>
             </w:r>
           </w:p>
         </w:tc>
@@ -1259,25 +1248,24 @@
               <w:bottom w:val="single" w:color="D9CFC0" w:sz="4"/>
               <w:right w:val="single" w:color="D9CFC0" w:sz="4"/>
             </w:tcBorders>
-            <w:shd w:fill="FBF8F3" w:color="auto" w:val="clear"/>
-            <w:tcMar>
-              <w:top w:type="dxa" w:w="80"/>
-              <w:left w:type="dxa" w:w="110"/>
-              <w:bottom w:type="dxa" w:w="80"/>
-              <w:right w:type="dxa" w:w="110"/>
-            </w:tcMar>
-          </w:tcPr>
-          <w:p>
-            <w:r>
-              <w:rPr>
-                <w:rFonts w:ascii="Calibri" w:cs="Calibri" w:eastAsia="Calibri" w:hAnsi="Calibri"/>
-                <w:b w:val="false"/>
-                <w:bCs w:val="false"/>
-                <w:color w:val="333333"/>
-                <w:sz w:val="19"/>
-                <w:szCs w:val="19"/>
-              </w:rPr>
-              <w:t xml:space="preserve">presentazioni/presentazione-v2.pptx</w:t>
+            <w:tcMar>
+              <w:top w:type="dxa" w:w="80"/>
+              <w:left w:type="dxa" w:w="110"/>
+              <w:bottom w:type="dxa" w:w="80"/>
+              <w:right w:type="dxa" w:w="110"/>
+            </w:tcMar>
+          </w:tcPr>
+          <w:p>
+            <w:r>
+              <w:rPr>
+                <w:rFonts w:ascii="Calibri" w:cs="Calibri" w:eastAsia="Calibri" w:hAnsi="Calibri"/>
+                <w:b w:val="false"/>
+                <w:bCs w:val="false"/>
+                <w:color w:val="333333"/>
+                <w:sz w:val="19"/>
+                <w:szCs w:val="19"/>
+              </w:rPr>
+              <w:t xml:space="preserve"/>
             </w:r>
           </w:p>
         </w:tc>

</xml_diff>